<commit_message>
Finalize v0.1.4 guide rendering
</commit_message>
<xml_diff>
--- a/docs/publications/N0JCG_NOAA_Weather_Radio_User_Guide_v0.1.4.docx
+++ b/docs/publications/N0JCG_NOAA_Weather_Radio_User_Guide_v0.1.4.docx
@@ -344,6 +344,19 @@
       </w:pPr>
       <w:r>
         <w:t>1. What N0JCG NOAA Weather Radio does</w:t>
+      </w:r>
+    </w:p>
+    <w:p>
+      <w:r>
+        <w:t>N0JCG NOAA Weather Radio is a receive-only Raspberry Pi appliance for all seven US NOAA Weather Radio channels. It uses FFT scoring to select the strongest candidate, provides narrow-FM browser audio, and supports operator-configurable SAME alert filters.</w:t>
+      </w:r>
+    </w:p>
+    <w:p>
+      <w:pPr>
+        <w:pStyle w:val="Heading1"/>
+      </w:pPr>
+      <w:r>
+        <w:t>2. Safety and operating boundary</w:t>
       </w:r>
     </w:p>
     <w:p>

</xml_diff>